<commit_message>
docs(1.1): 重生成 Word 报告(含图 8b/8c 进出水分带 ACF, 12 图 5 表)
Co-Authored-By: Claude Opus 4.8 <noreply@anthropic.com>
</commit_message>
<xml_diff>
--- a/Project 1 Data Quality Assessment/1.1 Decomposition/结果分析报告.docx
+++ b/Project 1 Data Quality Assessment/1.1 Decomposition/结果分析报告.docx
@@ -2460,10 +2460,29 @@
     </w:p>
     <w:p>
       <w:pPr>
-        <w:pStyle w:val="Heading1"/>
+        <w:ind w:left="432"/>
       </w:pPr>
       <w:r>
-        <w:t>7. 下游增益:去周期+白化提升故障可分性</w:t>
+        <w:rPr>
+          <w:i/>
+          <w:color w:val="444444"/>
+        </w:rPr>
+        <w:t xml:space="preserve">说明:分钟级 DO/ORP 的 ACF 图(图 8)滞后阶取 </w:t>
+      </w:r>
+      <w:r>
+        <w:rPr>
+          <w:b/>
+          <w:i/>
+          <w:color w:val="444444"/>
+        </w:rPr>
+        <w:t>60</w:t>
+      </w:r>
+      <w:r>
+        <w:rPr>
+          <w:i/>
+          <w:color w:val="444444"/>
+        </w:rPr>
+        <w:t>(≈1 h 的 1-min 滞后);进出水以小时为单位、按 24h 倍数分带,见图 8b/8c。</w:t>
       </w:r>
     </w:p>
     <w:p>
@@ -2471,7 +2490,7 @@
         <w:rPr>
           <w:b/>
         </w:rPr>
-        <w:t>图 9. 故障注入 AUC 随幅度曲线(原始 &lt; 去周期残差 &lt; 白化创新)</w:t>
+        <w:t>图 8b. 进水各变量白化前后 ACF(lag 48,按 1–24h / 25–48h 两带着色)</w:t>
       </w:r>
     </w:p>
     <w:p>
@@ -2481,8 +2500,243 @@
       <w:r>
         <w:drawing>
           <wp:inline xmlns:a="http://schemas.openxmlformats.org/drawingml/2006/main" xmlns:pic="http://schemas.openxmlformats.org/drawingml/2006/picture">
+            <wp:extent cx="5760720" cy="6204515"/>
+            <wp:docPr id="8" name="Picture 8"/>
+            <wp:cNvGraphicFramePr>
+              <a:graphicFrameLocks noChangeAspect="1"/>
+            </wp:cNvGraphicFramePr>
+            <a:graphic>
+              <a:graphicData uri="http://schemas.openxmlformats.org/drawingml/2006/picture">
+                <pic:pic>
+                  <pic:nvPicPr>
+                    <pic:cNvPr id="0" name="fig_W3_acf_influent_banded.png"/>
+                    <pic:cNvPicPr/>
+                  </pic:nvPicPr>
+                  <pic:blipFill>
+                    <a:blip r:embed="rId16"/>
+                    <a:stretch>
+                      <a:fillRect/>
+                    </a:stretch>
+                  </pic:blipFill>
+                  <pic:spPr>
+                    <a:xfrm>
+                      <a:off x="0" y="0"/>
+                      <a:ext cx="5760720" cy="6204515"/>
+                    </a:xfrm>
+                    <a:prstGeom prst="rect"/>
+                  </pic:spPr>
+                </pic:pic>
+              </a:graphicData>
+            </a:graphic>
+          </wp:inline>
+        </w:drawing>
+      </w:r>
+    </w:p>
+    <w:p>
+      <w:pPr>
+        <w:jc w:val="center"/>
+      </w:pPr>
+      <w:r>
+        <w:rPr>
+          <w:i/>
+          <w:color w:val="555555"/>
+          <w:sz w:val="17"/>
+        </w:rPr>
+        <w:t>图8b 进水分带ACF</w:t>
+      </w:r>
+    </w:p>
+    <w:p>
+      <w:r>
+        <w:rPr>
+          <w:b/>
+        </w:rPr>
+        <w:t>图 8c. 出水各变量白化前后 ACF(lag 72,按 1–24h / 25–48h / 49–72h 三带着色)</w:t>
+      </w:r>
+    </w:p>
+    <w:p>
+      <w:pPr>
+        <w:jc w:val="center"/>
+      </w:pPr>
+      <w:r>
+        <w:drawing>
+          <wp:inline xmlns:a="http://schemas.openxmlformats.org/drawingml/2006/main" xmlns:pic="http://schemas.openxmlformats.org/drawingml/2006/picture">
+            <wp:extent cx="5760720" cy="5558212"/>
+            <wp:docPr id="9" name="Picture 9"/>
+            <wp:cNvGraphicFramePr>
+              <a:graphicFrameLocks noChangeAspect="1"/>
+            </wp:cNvGraphicFramePr>
+            <a:graphic>
+              <a:graphicData uri="http://schemas.openxmlformats.org/drawingml/2006/picture">
+                <pic:pic>
+                  <pic:nvPicPr>
+                    <pic:cNvPr id="0" name="fig_W3_acf_effluent_banded.png"/>
+                    <pic:cNvPicPr/>
+                  </pic:nvPicPr>
+                  <pic:blipFill>
+                    <a:blip r:embed="rId17"/>
+                    <a:stretch>
+                      <a:fillRect/>
+                    </a:stretch>
+                  </pic:blipFill>
+                  <pic:spPr>
+                    <a:xfrm>
+                      <a:off x="0" y="0"/>
+                      <a:ext cx="5760720" cy="5558212"/>
+                    </a:xfrm>
+                    <a:prstGeom prst="rect"/>
+                  </pic:spPr>
+                </pic:pic>
+              </a:graphicData>
+            </a:graphic>
+          </wp:inline>
+        </w:drawing>
+      </w:r>
+    </w:p>
+    <w:p>
+      <w:pPr>
+        <w:jc w:val="center"/>
+      </w:pPr>
+      <w:r>
+        <w:rPr>
+          <w:i/>
+          <w:color w:val="555555"/>
+          <w:sz w:val="17"/>
+        </w:rPr>
+        <w:t>图8c 出水分带ACF</w:t>
+      </w:r>
+    </w:p>
+    <w:p>
+      <w:r>
+        <w:rPr>
+          <w:b/>
+        </w:rPr>
+        <w:t>解读(分带 ACF)。</w:t>
+      </w:r>
+      <w:r>
+        <w:t xml:space="preserve"> 对小时级进出水,以 24h 为单位把滞后分成日内(1–24h)、隔日(25–48h)、隔两日(49–72h)三带并以不同颜色着色,可直接判读"白化是否清除了日周期残留":</w:t>
+      </w:r>
+    </w:p>
+    <w:p>
+      <w:pPr>
+        <w:pStyle w:val="ListBullet"/>
+      </w:pPr>
+      <w:r>
+        <w:rPr>
+          <w:b/>
+        </w:rPr>
+        <w:t>良好白化</w:t>
+      </w:r>
+      <w:r>
+        <w:t>:</w:t>
+      </w:r>
+      <w:r>
+        <w:rPr>
+          <w:rFonts w:ascii="Consolas" w:hAnsi="Consolas" w:eastAsia="Consolas"/>
+        </w:rPr>
+        <w:t>inf_pH</w:t>
+      </w:r>
+      <w:r>
+        <w:t>、</w:t>
+      </w:r>
+      <w:r>
+        <w:rPr>
+          <w:rFonts w:ascii="Consolas" w:hAnsi="Consolas" w:eastAsia="Consolas"/>
+        </w:rPr>
+        <w:t>eff_COD</w:t>
+      </w:r>
+      <w:r>
+        <w:t xml:space="preserve"> 等通道,创新(右列)ACF 全面落入置信带内、各带均无突出柱,接近白噪声。</w:t>
+      </w:r>
+    </w:p>
+    <w:p>
+      <w:pPr>
+        <w:pStyle w:val="ListBullet"/>
+      </w:pPr>
+      <w:r>
+        <w:rPr>
+          <w:b/>
+        </w:rPr>
+        <w:t>长记忆/兜底通道</w:t>
+      </w:r>
+      <w:r>
+        <w:t>:</w:t>
+      </w:r>
+      <w:r>
+        <w:rPr>
+          <w:rFonts w:ascii="Consolas" w:hAnsi="Consolas" w:eastAsia="Consolas"/>
+        </w:rPr>
+        <w:t>inf_T</w:t>
+      </w:r>
+      <w:r>
+        <w:t>、</w:t>
+      </w:r>
+      <w:r>
+        <w:rPr>
+          <w:rFonts w:ascii="Consolas" w:hAnsi="Consolas" w:eastAsia="Consolas"/>
+        </w:rPr>
+        <w:t>eff_T</w:t>
+      </w:r>
+      <w:r>
+        <w:t>、</w:t>
+      </w:r>
+      <w:r>
+        <w:rPr>
+          <w:rFonts w:ascii="Consolas" w:hAnsi="Consolas" w:eastAsia="Consolas"/>
+        </w:rPr>
+        <w:t>eff_pH</w:t>
+      </w:r>
+      <w:r>
+        <w:t xml:space="preserve"> 在残差与创新中均呈缓慢衰减、日内带(蓝)持续显著——这些正是接受门未通过、走 </w:t>
+      </w:r>
+      <w:r>
+        <w:rPr>
+          <w:rFonts w:ascii="Consolas" w:hAnsi="Consolas" w:eastAsia="Consolas"/>
+        </w:rPr>
+        <w:t>robust_z</w:t>
+      </w:r>
+      <w:r>
+        <w:t xml:space="preserve"> 兜底的通道(温度/酸碱长记忆强),其"创新"未真正白化、ACF 被保留,与 §6 "11 通过 / 22 兜底"的诚实结论一致。</w:t>
+      </w:r>
+    </w:p>
+    <w:p>
+      <w:pPr>
+        <w:pStyle w:val="ListBullet"/>
+      </w:pPr>
+      <w:r>
+        <w:rPr>
+          <w:b/>
+        </w:rPr>
+        <w:t>日周期残留判读</w:t>
+      </w:r>
+      <w:r>
+        <w:t>:在带分界(lag 24/48/72)附近若出现跨置信带的柱,说明仍有日周期未被吸收;本结果中多数水质通道的日内带在白化后显著回落,少数(TP/TN)在隔日带尚有弱结构,留待 §1.2 评分关注。</w:t>
+      </w:r>
+    </w:p>
+    <w:p>
+      <w:pPr>
+        <w:pStyle w:val="Heading1"/>
+      </w:pPr>
+      <w:r>
+        <w:t>7. 下游增益:去周期+白化提升故障可分性</w:t>
+      </w:r>
+    </w:p>
+    <w:p>
+      <w:r>
+        <w:rPr>
+          <w:b/>
+        </w:rPr>
+        <w:t>图 9. 故障注入 AUC 随幅度曲线(原始 &lt; 去周期残差 &lt; 白化创新)</w:t>
+      </w:r>
+    </w:p>
+    <w:p>
+      <w:pPr>
+        <w:jc w:val="center"/>
+      </w:pPr>
+      <w:r>
+        <w:drawing>
+          <wp:inline xmlns:a="http://schemas.openxmlformats.org/drawingml/2006/main" xmlns:pic="http://schemas.openxmlformats.org/drawingml/2006/picture">
             <wp:extent cx="5760720" cy="2456616"/>
-            <wp:docPr id="8" name="Picture 8"/>
+            <wp:docPr id="10" name="Picture 10"/>
             <wp:cNvGraphicFramePr>
               <a:graphicFrameLocks noChangeAspect="1"/>
             </wp:cNvGraphicFramePr>
@@ -2494,7 +2748,7 @@
                     <pic:cNvPicPr/>
                   </pic:nvPicPr>
                   <pic:blipFill>
-                    <a:blip r:embed="rId16"/>
+                    <a:blip r:embed="rId18"/>
                     <a:stretch>
                       <a:fillRect/>
                     </a:stretch>
@@ -2848,7 +3102,7 @@
         <w:drawing>
           <wp:inline xmlns:a="http://schemas.openxmlformats.org/drawingml/2006/main" xmlns:pic="http://schemas.openxmlformats.org/drawingml/2006/picture">
             <wp:extent cx="5760720" cy="5471171"/>
-            <wp:docPr id="9" name="Picture 9"/>
+            <wp:docPr id="11" name="Picture 11"/>
             <wp:cNvGraphicFramePr>
               <a:graphicFrameLocks noChangeAspect="1"/>
             </wp:cNvGraphicFramePr>
@@ -2860,7 +3114,7 @@
                     <pic:cNvPicPr/>
                   </pic:nvPicPr>
                   <pic:blipFill>
-                    <a:blip r:embed="rId17"/>
+                    <a:blip r:embed="rId19"/>
                     <a:stretch>
                       <a:fillRect/>
                     </a:stretch>
@@ -2900,7 +3154,7 @@
         <w:drawing>
           <wp:inline xmlns:a="http://schemas.openxmlformats.org/drawingml/2006/main" xmlns:pic="http://schemas.openxmlformats.org/drawingml/2006/picture">
             <wp:extent cx="5760720" cy="4900718"/>
-            <wp:docPr id="10" name="Picture 10"/>
+            <wp:docPr id="12" name="Picture 12"/>
             <wp:cNvGraphicFramePr>
               <a:graphicFrameLocks noChangeAspect="1"/>
             </wp:cNvGraphicFramePr>
@@ -2912,7 +3166,7 @@
                     <pic:cNvPicPr/>
                   </pic:nvPicPr>
                   <pic:blipFill>
-                    <a:blip r:embed="rId18"/>
+                    <a:blip r:embed="rId20"/>
                     <a:stretch>
                       <a:fillRect/>
                     </a:stretch>
@@ -3481,6 +3735,9 @@
               </w:rPr>
               <w:t>outputs/figures/fig_W3_acf_DO_1_3.png</w:t>
             </w:r>
+            <w:r>
+              <w:t>(lag 60)</w:t>
+            </w:r>
           </w:p>
         </w:tc>
         <w:tc>
@@ -3503,6 +3760,47 @@
                 <w:rFonts w:ascii="Consolas" w:hAnsi="Consolas" w:eastAsia="Consolas"/>
               </w:rPr>
               <w:t>arma_garch_order_table.csv</w:t>
+            </w:r>
+          </w:p>
+        </w:tc>
+      </w:tr>
+      <w:tr>
+        <w:tc>
+          <w:tcPr>
+            <w:tcW w:type="dxa" w:w="2880"/>
+          </w:tcPr>
+          <w:p>
+            <w:r/>
+            <w:r>
+              <w:t>图 8b/8c</w:t>
+            </w:r>
+          </w:p>
+        </w:tc>
+        <w:tc>
+          <w:tcPr>
+            <w:tcW w:type="dxa" w:w="2880"/>
+          </w:tcPr>
+          <w:p>
+            <w:r/>
+            <w:r>
+              <w:rPr>
+                <w:rFonts w:ascii="Consolas" w:hAnsi="Consolas" w:eastAsia="Consolas"/>
+              </w:rPr>
+              <w:t>outputs/figures/fig_W3_acf_{influent,effluent}_banded.png</w:t>
+            </w:r>
+          </w:p>
+        </w:tc>
+        <w:tc>
+          <w:tcPr>
+            <w:tcW w:type="dxa" w:w="2880"/>
+          </w:tcPr>
+          <w:p>
+            <w:r/>
+            <w:r>
+              <w:rPr>
+                <w:rFonts w:ascii="Consolas" w:hAnsi="Consolas" w:eastAsia="Consolas"/>
+              </w:rPr>
+              <w:t>residual/innovation_{influent,effluent}.parquet</w:t>
             </w:r>
           </w:p>
         </w:tc>

</xml_diff>